<commit_message>
Adicionada versão final da documentação do projeto para Sprint 1
</commit_message>
<xml_diff>
--- a/documentacao-vooh/documentacao/Documentação_VOOH.docx
+++ b/documentacao-vooh/documentacao/Documentação_VOOH.docx
@@ -626,7 +626,7 @@
             <w:sz w:val="24"/>
             <w:szCs w:val="24"/>
           </w:rPr>
-          <w:t>5</w:t>
+          <w:t>6</w:t>
         </w:r>
       </w:hyperlink>
     </w:p>
@@ -683,7 +683,7 @@
             <w:sz w:val="24"/>
             <w:szCs w:val="24"/>
           </w:rPr>
-          <w:t>7</w:t>
+          <w:t>8</w:t>
         </w:r>
       </w:hyperlink>
     </w:p>
@@ -739,7 +739,7 @@
             <w:sz w:val="24"/>
             <w:szCs w:val="24"/>
           </w:rPr>
-          <w:t>8</w:t>
+          <w:t>9</w:t>
         </w:r>
       </w:hyperlink>
     </w:p>
@@ -830,7 +830,7 @@
             <w:sz w:val="24"/>
             <w:szCs w:val="24"/>
           </w:rPr>
-          <w:t>8</w:t>
+          <w:t>9</w:t>
         </w:r>
       </w:hyperlink>
     </w:p>
@@ -903,7 +903,7 @@
             <w:sz w:val="24"/>
             <w:szCs w:val="24"/>
           </w:rPr>
-          <w:t>8</w:t>
+          <w:t>9</w:t>
         </w:r>
       </w:hyperlink>
     </w:p>
@@ -993,7 +993,7 @@
             <w:sz w:val="24"/>
             <w:szCs w:val="24"/>
           </w:rPr>
-          <w:t>9</w:t>
+          <w:t>10</w:t>
         </w:r>
       </w:hyperlink>
     </w:p>
@@ -1093,7 +1093,7 @@
             <w:sz w:val="24"/>
             <w:szCs w:val="24"/>
           </w:rPr>
-          <w:t>0</w:t>
+          <w:t>1</w:t>
         </w:r>
       </w:hyperlink>
     </w:p>
@@ -1142,7 +1142,7 @@
           <w:sz w:val="24"/>
           <w:szCs w:val="24"/>
         </w:rPr>
-        <w:t>0</w:t>
+        <w:t>1</w:t>
       </w:r>
     </w:p>
     <w:p>
@@ -1183,7 +1183,7 @@
           <w:sz w:val="24"/>
           <w:szCs w:val="24"/>
         </w:rPr>
-        <w:t>0</w:t>
+        <w:t>1</w:t>
       </w:r>
     </w:p>
     <w:p>
@@ -1265,7 +1265,7 @@
             <w:sz w:val="24"/>
             <w:szCs w:val="24"/>
           </w:rPr>
-          <w:t>1</w:t>
+          <w:t>2</w:t>
         </w:r>
       </w:hyperlink>
     </w:p>
@@ -1346,7 +1346,16 @@
             <w:sz w:val="24"/>
             <w:szCs w:val="24"/>
           </w:rPr>
-          <w:t>11</w:t>
+          <w:t>1</w:t>
+        </w:r>
+        <w:r>
+          <w:rPr>
+            <w:rFonts w:cs="Arial"/>
+            <w:spacing w:val="-5"/>
+            <w:sz w:val="24"/>
+            <w:szCs w:val="24"/>
+          </w:rPr>
+          <w:t>2</w:t>
         </w:r>
       </w:hyperlink>
     </w:p>
@@ -1403,7 +1412,16 @@
           <w:sz w:val="24"/>
           <w:szCs w:val="24"/>
         </w:rPr>
-        <w:t>12</w:t>
+        <w:t>1</w:t>
+      </w:r>
+      <w:r>
+        <w:rPr>
+          <w:rFonts w:cs="Arial"/>
+          <w:spacing w:val="-5"/>
+          <w:sz w:val="24"/>
+          <w:szCs w:val="24"/>
+        </w:rPr>
+        <w:t>3</w:t>
       </w:r>
     </w:p>
     <w:p>
@@ -1459,7 +1477,16 @@
             <w:sz w:val="24"/>
             <w:szCs w:val="24"/>
           </w:rPr>
-          <w:t>12</w:t>
+          <w:t>1</w:t>
+        </w:r>
+        <w:r>
+          <w:rPr>
+            <w:rFonts w:cs="Arial"/>
+            <w:spacing w:val="-5"/>
+            <w:sz w:val="24"/>
+            <w:szCs w:val="24"/>
+          </w:rPr>
+          <w:t>3</w:t>
         </w:r>
       </w:hyperlink>
     </w:p>
@@ -1499,7 +1526,16 @@
           <w:szCs w:val="24"/>
         </w:rPr>
         <w:tab/>
-        <w:t>13</w:t>
+        <w:t>1</w:t>
+      </w:r>
+      <w:r>
+        <w:rPr>
+          <w:rFonts w:cs="Arial"/>
+          <w:spacing w:val="-5"/>
+          <w:sz w:val="24"/>
+          <w:szCs w:val="24"/>
+        </w:rPr>
+        <w:t>4</w:t>
       </w:r>
     </w:p>
     <w:p>
@@ -1557,7 +1593,7 @@
             <w:sz w:val="24"/>
             <w:szCs w:val="24"/>
           </w:rPr>
-          <w:t>4</w:t>
+          <w:t>5</w:t>
         </w:r>
       </w:hyperlink>
     </w:p>
@@ -1611,7 +1647,16 @@
             <w:sz w:val="24"/>
             <w:szCs w:val="24"/>
           </w:rPr>
-          <w:t>15</w:t>
+          <w:t>1</w:t>
+        </w:r>
+        <w:r>
+          <w:rPr>
+            <w:rFonts w:ascii="Arial MT" w:hAnsi="Arial MT"/>
+            <w:spacing w:val="-5"/>
+            <w:sz w:val="24"/>
+            <w:szCs w:val="24"/>
+          </w:rPr>
+          <w:t>6</w:t>
         </w:r>
       </w:hyperlink>
     </w:p>
@@ -2995,7 +3040,23 @@
           <w:b/>
           <w:bCs/>
         </w:rPr>
-        <w:t xml:space="preserve">Figura 1 – Display Digital Out </w:t>
+        <w:t xml:space="preserve">Figura </w:t>
+      </w:r>
+      <w:r>
+        <w:rPr>
+          <w:rFonts w:ascii="Arial MT" w:eastAsia="Arial" w:hAnsi="Arial MT" w:cs="Arial"/>
+          <w:b/>
+          <w:bCs/>
+        </w:rPr>
+        <w:t>3</w:t>
+      </w:r>
+      <w:r>
+        <w:rPr>
+          <w:rFonts w:ascii="Arial MT" w:eastAsia="Arial" w:hAnsi="Arial MT" w:cs="Arial"/>
+          <w:b/>
+          <w:bCs/>
+        </w:rPr>
+        <w:t xml:space="preserve"> – Display Digital Out </w:t>
       </w:r>
       <w:proofErr w:type="spellStart"/>
       <w:r>
@@ -4354,6 +4415,97 @@
     </w:p>
     <w:p>
       <w:pPr>
+        <w:pStyle w:val="PargrafodaLista"/>
+        <w:ind w:left="1080"/>
+        <w:jc w:val="both"/>
+        <w:rPr>
+          <w:rFonts w:ascii="Arial MT" w:hAnsi="Arial MT" w:cs="Arial"/>
+          <w:color w:val="000000" w:themeColor="text1"/>
+        </w:rPr>
+      </w:pPr>
+    </w:p>
+    <w:p>
+      <w:pPr>
+        <w:pStyle w:val="PargrafodaLista"/>
+        <w:ind w:left="1080"/>
+        <w:jc w:val="both"/>
+        <w:rPr>
+          <w:rFonts w:ascii="Arial MT" w:hAnsi="Arial MT" w:cs="Arial"/>
+          <w:color w:val="000000" w:themeColor="text1"/>
+        </w:rPr>
+      </w:pPr>
+      <w:r>
+        <w:rPr>
+          <w:rFonts w:ascii="Arial MT" w:hAnsi="Arial MT" w:cs="Arial"/>
+          <w:color w:val="000000" w:themeColor="text1"/>
+        </w:rPr>
+        <w:tab/>
+        <w:t xml:space="preserve">Os requisitos do projeto se apresentam na versão </w:t>
+      </w:r>
+      <w:r>
+        <w:rPr>
+          <w:rFonts w:ascii="Arial MT" w:hAnsi="Arial MT" w:cs="Arial"/>
+          <w:color w:val="000000" w:themeColor="text1"/>
+        </w:rPr>
+        <w:t>reduzida</w:t>
+      </w:r>
+      <w:r>
+        <w:rPr>
+          <w:rFonts w:ascii="Arial MT" w:hAnsi="Arial MT" w:cs="Arial"/>
+          <w:color w:val="000000" w:themeColor="text1"/>
+        </w:rPr>
+        <w:t xml:space="preserve"> do backlog</w:t>
+      </w:r>
+      <w:r>
+        <w:rPr>
+          <w:rFonts w:ascii="Arial MT" w:hAnsi="Arial MT" w:cs="Arial"/>
+          <w:color w:val="000000" w:themeColor="text1"/>
+        </w:rPr>
+        <w:t xml:space="preserve"> a seguir</w:t>
+      </w:r>
+      <w:r>
+        <w:rPr>
+          <w:rFonts w:ascii="Arial MT" w:hAnsi="Arial MT" w:cs="Arial"/>
+          <w:color w:val="000000" w:themeColor="text1"/>
+        </w:rPr>
+        <w:t>:</w:t>
+      </w:r>
+    </w:p>
+    <w:p>
+      <w:pPr>
+        <w:pStyle w:val="PargrafodaLista"/>
+        <w:ind w:left="1080"/>
+        <w:jc w:val="both"/>
+        <w:rPr>
+          <w:rFonts w:ascii="Arial MT" w:hAnsi="Arial MT" w:cs="Arial"/>
+          <w:color w:val="000000" w:themeColor="text1"/>
+        </w:rPr>
+      </w:pPr>
+    </w:p>
+    <w:p>
+      <w:pPr>
+        <w:pStyle w:val="PargrafodaLista"/>
+        <w:ind w:left="1080"/>
+        <w:jc w:val="center"/>
+        <w:rPr>
+          <w:rFonts w:ascii="Arial MT" w:hAnsi="Arial MT" w:cs="Arial"/>
+          <w:b/>
+          <w:bCs/>
+          <w:color w:val="000000" w:themeColor="text1"/>
+        </w:rPr>
+      </w:pPr>
+      <w:r>
+        <w:rPr>
+          <w:rFonts w:ascii="Arial MT" w:hAnsi="Arial MT" w:cs="Arial"/>
+          <w:b/>
+          <w:bCs/>
+          <w:color w:val="000000" w:themeColor="text1"/>
+        </w:rPr>
+        <w:t>Figura 4 – Versão enxuta do backlog do projeto</w:t>
+      </w:r>
+    </w:p>
+    <w:p>
+      <w:pPr>
         <w:jc w:val="both"/>
         <w:rPr>
           <w:rFonts w:ascii="Arial MT" w:hAnsi="Arial MT" w:cs="Arial"/>
@@ -4566,46 +4718,6 @@
     </w:p>
     <w:p>
       <w:pPr>
-        <w:jc w:val="center"/>
-        <w:rPr>
-          <w:rFonts w:ascii="Arial MT" w:eastAsia="Aptos" w:hAnsi="Arial MT" w:cs="Arial"/>
-          <w:color w:val="467886"/>
-          <w:u w:val="single"/>
-        </w:rPr>
-      </w:pPr>
-    </w:p>
-    <w:p>
-      <w:pPr>
-        <w:jc w:val="center"/>
-        <w:rPr>
-          <w:rFonts w:ascii="Arial MT" w:eastAsia="Aptos" w:hAnsi="Arial MT" w:cs="Arial"/>
-          <w:color w:val="467886"/>
-          <w:u w:val="single"/>
-        </w:rPr>
-      </w:pPr>
-    </w:p>
-    <w:p>
-      <w:pPr>
-        <w:jc w:val="center"/>
-        <w:rPr>
-          <w:rFonts w:ascii="Arial MT" w:eastAsia="Aptos" w:hAnsi="Arial MT" w:cs="Arial"/>
-          <w:color w:val="467886"/>
-          <w:u w:val="single"/>
-        </w:rPr>
-      </w:pPr>
-    </w:p>
-    <w:p>
-      <w:pPr>
-        <w:jc w:val="center"/>
-        <w:rPr>
-          <w:rFonts w:ascii="Arial MT" w:eastAsia="Aptos" w:hAnsi="Arial MT" w:cs="Arial"/>
-          <w:color w:val="467886"/>
-          <w:u w:val="single"/>
-        </w:rPr>
-      </w:pPr>
-    </w:p>
-    <w:p>
-      <w:pPr>
         <w:pStyle w:val="PargrafodaLista"/>
         <w:numPr>
           <w:ilvl w:val="1"/>
@@ -10152,6 +10264,942 @@
     </w:p>
     <w:p>
       <w:pPr>
+        <w:spacing w:after="0" w:line="360" w:lineRule="atLeast"/>
+        <w:rPr>
+          <w:rFonts w:ascii="Arial MT" w:eastAsia="Times New Roman" w:hAnsi="Arial MT" w:cs="Calibri"/>
+          <w:color w:val="000000"/>
+          <w:kern w:val="0"/>
+          <w14:ligatures w14:val="none"/>
+        </w:rPr>
+      </w:pPr>
+      <w:r>
+        <w:rPr>
+          <w:rFonts w:ascii="Arial MT" w:eastAsia="Times New Roman" w:hAnsi="Arial MT" w:cs="Calibri"/>
+          <w:color w:val="000000"/>
+          <w:kern w:val="0"/>
+          <w14:ligatures w14:val="none"/>
+        </w:rPr>
+        <w:t>PRECEDENCE RESEARCH. </w:t>
+      </w:r>
+      <w:r>
+        <w:rPr>
+          <w:rFonts w:ascii="Arial MT" w:eastAsia="Times New Roman" w:hAnsi="Arial MT" w:cs="Calibri"/>
+          <w:b/>
+          <w:bCs/>
+          <w:color w:val="000000"/>
+          <w:kern w:val="0"/>
+          <w14:ligatures w14:val="none"/>
+        </w:rPr>
+        <w:t>Digital Out-</w:t>
+      </w:r>
+      <w:proofErr w:type="spellStart"/>
+      <w:r>
+        <w:rPr>
+          <w:rFonts w:ascii="Arial MT" w:eastAsia="Times New Roman" w:hAnsi="Arial MT" w:cs="Calibri"/>
+          <w:b/>
+          <w:bCs/>
+          <w:color w:val="000000"/>
+          <w:kern w:val="0"/>
+          <w14:ligatures w14:val="none"/>
+        </w:rPr>
+        <w:t>Of</w:t>
+      </w:r>
+      <w:proofErr w:type="spellEnd"/>
+      <w:r>
+        <w:rPr>
+          <w:rFonts w:ascii="Arial MT" w:eastAsia="Times New Roman" w:hAnsi="Arial MT" w:cs="Calibri"/>
+          <w:b/>
+          <w:bCs/>
+          <w:color w:val="000000"/>
+          <w:kern w:val="0"/>
+          <w14:ligatures w14:val="none"/>
+        </w:rPr>
+        <w:t xml:space="preserve">-Home </w:t>
+      </w:r>
+      <w:proofErr w:type="spellStart"/>
+      <w:r>
+        <w:rPr>
+          <w:rFonts w:ascii="Arial MT" w:eastAsia="Times New Roman" w:hAnsi="Arial MT" w:cs="Calibri"/>
+          <w:b/>
+          <w:bCs/>
+          <w:color w:val="000000"/>
+          <w:kern w:val="0"/>
+          <w14:ligatures w14:val="none"/>
+        </w:rPr>
+        <w:t>Advertising</w:t>
+      </w:r>
+      <w:proofErr w:type="spellEnd"/>
+      <w:r>
+        <w:rPr>
+          <w:rFonts w:ascii="Arial MT" w:eastAsia="Times New Roman" w:hAnsi="Arial MT" w:cs="Calibri"/>
+          <w:b/>
+          <w:bCs/>
+          <w:color w:val="000000"/>
+          <w:kern w:val="0"/>
+          <w14:ligatures w14:val="none"/>
+        </w:rPr>
+        <w:t xml:space="preserve"> Market </w:t>
+      </w:r>
+      <w:proofErr w:type="spellStart"/>
+      <w:r>
+        <w:rPr>
+          <w:rFonts w:ascii="Arial MT" w:eastAsia="Times New Roman" w:hAnsi="Arial MT" w:cs="Calibri"/>
+          <w:b/>
+          <w:bCs/>
+          <w:color w:val="000000"/>
+          <w:kern w:val="0"/>
+          <w14:ligatures w14:val="none"/>
+        </w:rPr>
+        <w:t>Size</w:t>
+      </w:r>
+      <w:proofErr w:type="spellEnd"/>
+      <w:r>
+        <w:rPr>
+          <w:rFonts w:ascii="Arial MT" w:eastAsia="Times New Roman" w:hAnsi="Arial MT" w:cs="Calibri"/>
+          <w:b/>
+          <w:bCs/>
+          <w:color w:val="000000"/>
+          <w:kern w:val="0"/>
+          <w14:ligatures w14:val="none"/>
+        </w:rPr>
+        <w:t xml:space="preserve">, </w:t>
+      </w:r>
+      <w:proofErr w:type="spellStart"/>
+      <w:r>
+        <w:rPr>
+          <w:rFonts w:ascii="Arial MT" w:eastAsia="Times New Roman" w:hAnsi="Arial MT" w:cs="Calibri"/>
+          <w:b/>
+          <w:bCs/>
+          <w:color w:val="000000"/>
+          <w:kern w:val="0"/>
+          <w14:ligatures w14:val="none"/>
+        </w:rPr>
+        <w:t>Report</w:t>
+      </w:r>
+      <w:proofErr w:type="spellEnd"/>
+      <w:r>
+        <w:rPr>
+          <w:rFonts w:ascii="Arial MT" w:eastAsia="Times New Roman" w:hAnsi="Arial MT" w:cs="Calibri"/>
+          <w:b/>
+          <w:bCs/>
+          <w:color w:val="000000"/>
+          <w:kern w:val="0"/>
+          <w14:ligatures w14:val="none"/>
+        </w:rPr>
+        <w:t xml:space="preserve"> </w:t>
+      </w:r>
+      <w:proofErr w:type="spellStart"/>
+      <w:r>
+        <w:rPr>
+          <w:rFonts w:ascii="Arial MT" w:eastAsia="Times New Roman" w:hAnsi="Arial MT" w:cs="Calibri"/>
+          <w:b/>
+          <w:bCs/>
+          <w:color w:val="000000"/>
+          <w:kern w:val="0"/>
+          <w14:ligatures w14:val="none"/>
+        </w:rPr>
+        <w:t>by</w:t>
+      </w:r>
+      <w:proofErr w:type="spellEnd"/>
+      <w:r>
+        <w:rPr>
+          <w:rFonts w:ascii="Arial MT" w:eastAsia="Times New Roman" w:hAnsi="Arial MT" w:cs="Calibri"/>
+          <w:b/>
+          <w:bCs/>
+          <w:color w:val="000000"/>
+          <w:kern w:val="0"/>
+          <w14:ligatures w14:val="none"/>
+        </w:rPr>
+        <w:t xml:space="preserve"> 2034</w:t>
+      </w:r>
+      <w:r>
+        <w:rPr>
+          <w:rFonts w:ascii="Arial MT" w:eastAsia="Times New Roman" w:hAnsi="Arial MT" w:cs="Calibri"/>
+          <w:color w:val="000000"/>
+          <w:kern w:val="0"/>
+          <w14:ligatures w14:val="none"/>
+        </w:rPr>
+        <w:t>. Disponível em: &lt;https://www.precedenceresearch.com/digital-out-of-home-advertising-market&gt;. Acesso em: 5 mar. 2026.</w:t>
+      </w:r>
+    </w:p>
+    <w:p>
+      <w:pPr>
+        <w:spacing w:after="0" w:line="360" w:lineRule="atLeast"/>
+        <w:rPr>
+          <w:rFonts w:ascii="Arial MT" w:eastAsia="Times New Roman" w:hAnsi="Arial MT" w:cs="Calibri"/>
+          <w:color w:val="000000"/>
+          <w:kern w:val="0"/>
+          <w14:ligatures w14:val="none"/>
+        </w:rPr>
+      </w:pPr>
+    </w:p>
+    <w:p>
+      <w:pPr>
+        <w:spacing w:after="0" w:line="360" w:lineRule="atLeast"/>
+        <w:rPr>
+          <w:rFonts w:ascii="Arial MT" w:eastAsia="Times New Roman" w:hAnsi="Arial MT" w:cs="Calibri"/>
+          <w:color w:val="000000"/>
+          <w:kern w:val="0"/>
+          <w14:ligatures w14:val="none"/>
+        </w:rPr>
+      </w:pPr>
+      <w:r>
+        <w:rPr>
+          <w:rFonts w:ascii="Arial MT" w:eastAsia="Times New Roman" w:hAnsi="Arial MT" w:cs="Calibri"/>
+          <w:color w:val="000000"/>
+          <w:kern w:val="0"/>
+          <w14:ligatures w14:val="none"/>
+        </w:rPr>
+        <w:t>MAG. </w:t>
+      </w:r>
+      <w:r>
+        <w:rPr>
+          <w:rFonts w:ascii="Arial MT" w:eastAsia="Times New Roman" w:hAnsi="Arial MT" w:cs="Calibri"/>
+          <w:b/>
+          <w:bCs/>
+          <w:color w:val="000000"/>
+          <w:kern w:val="0"/>
+          <w14:ligatures w14:val="none"/>
+        </w:rPr>
+        <w:t>A Ascensão da Mídia Digital Out-</w:t>
+      </w:r>
+      <w:proofErr w:type="spellStart"/>
+      <w:r>
+        <w:rPr>
+          <w:rFonts w:ascii="Arial MT" w:eastAsia="Times New Roman" w:hAnsi="Arial MT" w:cs="Calibri"/>
+          <w:b/>
+          <w:bCs/>
+          <w:color w:val="000000"/>
+          <w:kern w:val="0"/>
+          <w14:ligatures w14:val="none"/>
+        </w:rPr>
+        <w:t>of</w:t>
+      </w:r>
+      <w:proofErr w:type="spellEnd"/>
+      <w:r>
+        <w:rPr>
+          <w:rFonts w:ascii="Arial MT" w:eastAsia="Times New Roman" w:hAnsi="Arial MT" w:cs="Calibri"/>
+          <w:b/>
+          <w:bCs/>
+          <w:color w:val="000000"/>
+          <w:kern w:val="0"/>
+          <w14:ligatures w14:val="none"/>
+        </w:rPr>
+        <w:t xml:space="preserve">-Home (DOOH) no Varejo Brasileiro: Tendências e Oportunidades - DFS Digital </w:t>
+      </w:r>
+      <w:proofErr w:type="spellStart"/>
+      <w:r>
+        <w:rPr>
+          <w:rFonts w:ascii="Arial MT" w:eastAsia="Times New Roman" w:hAnsi="Arial MT" w:cs="Calibri"/>
+          <w:b/>
+          <w:bCs/>
+          <w:color w:val="000000"/>
+          <w:kern w:val="0"/>
+          <w14:ligatures w14:val="none"/>
+        </w:rPr>
+        <w:t>Signage</w:t>
+      </w:r>
+      <w:proofErr w:type="spellEnd"/>
+      <w:r>
+        <w:rPr>
+          <w:rFonts w:ascii="Arial MT" w:eastAsia="Times New Roman" w:hAnsi="Arial MT" w:cs="Calibri"/>
+          <w:color w:val="000000"/>
+          <w:kern w:val="0"/>
+          <w14:ligatures w14:val="none"/>
+        </w:rPr>
+        <w:t>. Disponível em: &lt;https://dfsdigital.com.br/</w:t>
+      </w:r>
+      <w:proofErr w:type="spellStart"/>
+      <w:r>
+        <w:rPr>
+          <w:rFonts w:ascii="Arial MT" w:eastAsia="Times New Roman" w:hAnsi="Arial MT" w:cs="Calibri"/>
+          <w:color w:val="000000"/>
+          <w:kern w:val="0"/>
+          <w14:ligatures w14:val="none"/>
+        </w:rPr>
+        <w:t>midia_digital</w:t>
+      </w:r>
+      <w:proofErr w:type="spellEnd"/>
+      <w:r>
+        <w:rPr>
+          <w:rFonts w:ascii="Arial MT" w:eastAsia="Times New Roman" w:hAnsi="Arial MT" w:cs="Calibri"/>
+          <w:color w:val="000000"/>
+          <w:kern w:val="0"/>
+          <w14:ligatures w14:val="none"/>
+        </w:rPr>
+        <w:t>/&gt;. Acesso em: 5 mar. 2026.</w:t>
+      </w:r>
+    </w:p>
+    <w:p>
+      <w:pPr>
+        <w:spacing w:after="0" w:line="360" w:lineRule="atLeast"/>
+        <w:rPr>
+          <w:rFonts w:ascii="Arial MT" w:eastAsia="Times New Roman" w:hAnsi="Arial MT" w:cs="Calibri"/>
+          <w:color w:val="000000"/>
+          <w:kern w:val="0"/>
+          <w14:ligatures w14:val="none"/>
+        </w:rPr>
+      </w:pPr>
+    </w:p>
+    <w:p>
+      <w:pPr>
+        <w:spacing w:after="0" w:line="360" w:lineRule="atLeast"/>
+        <w:rPr>
+          <w:rFonts w:ascii="Arial MT" w:eastAsia="Times New Roman" w:hAnsi="Arial MT" w:cs="Calibri"/>
+          <w:color w:val="000000"/>
+          <w:kern w:val="0"/>
+          <w14:ligatures w14:val="none"/>
+        </w:rPr>
+      </w:pPr>
+      <w:r>
+        <w:rPr>
+          <w:rFonts w:ascii="Arial MT" w:eastAsia="Times New Roman" w:hAnsi="Arial MT" w:cs="Calibri"/>
+          <w:color w:val="000000"/>
+          <w:kern w:val="0"/>
+          <w14:ligatures w14:val="none"/>
+        </w:rPr>
+        <w:t>REDAÇÃO. </w:t>
+      </w:r>
+      <w:r>
+        <w:rPr>
+          <w:rFonts w:ascii="Arial MT" w:eastAsia="Times New Roman" w:hAnsi="Arial MT" w:cs="Calibri"/>
+          <w:b/>
+          <w:bCs/>
+          <w:color w:val="000000"/>
+          <w:kern w:val="0"/>
+          <w14:ligatures w14:val="none"/>
+        </w:rPr>
+        <w:t xml:space="preserve">Quando o LED deixa de ser tela e passa a ser infraestrutura - </w:t>
+      </w:r>
+      <w:proofErr w:type="spellStart"/>
+      <w:r>
+        <w:rPr>
+          <w:rFonts w:ascii="Arial MT" w:eastAsia="Times New Roman" w:hAnsi="Arial MT" w:cs="Calibri"/>
+          <w:b/>
+          <w:bCs/>
+          <w:color w:val="000000"/>
+          <w:kern w:val="0"/>
+          <w14:ligatures w14:val="none"/>
+        </w:rPr>
+        <w:t>Inforchannel</w:t>
+      </w:r>
+      <w:proofErr w:type="spellEnd"/>
+      <w:r>
+        <w:rPr>
+          <w:rFonts w:ascii="Arial MT" w:eastAsia="Times New Roman" w:hAnsi="Arial MT" w:cs="Calibri"/>
+          <w:color w:val="000000"/>
+          <w:kern w:val="0"/>
+          <w14:ligatures w14:val="none"/>
+        </w:rPr>
+        <w:t>. Disponível em: &lt;https://inforchannel.com.br/2026/02/04/quando-o-led-deixa-de-ser-tela-e-passa-a-ser-infraestrutura/&gt;. Acesso em: 5 mar. 2026.</w:t>
+      </w:r>
+    </w:p>
+    <w:p>
+      <w:pPr>
+        <w:spacing w:after="0" w:line="360" w:lineRule="atLeast"/>
+        <w:rPr>
+          <w:rFonts w:ascii="Arial MT" w:eastAsia="Times New Roman" w:hAnsi="Arial MT" w:cs="Calibri"/>
+          <w:color w:val="000000"/>
+          <w:kern w:val="0"/>
+          <w14:ligatures w14:val="none"/>
+        </w:rPr>
+      </w:pPr>
+    </w:p>
+    <w:p>
+      <w:pPr>
+        <w:spacing w:after="0" w:line="360" w:lineRule="atLeast"/>
+        <w:rPr>
+          <w:rFonts w:ascii="Arial MT" w:eastAsia="Times New Roman" w:hAnsi="Arial MT" w:cs="Calibri"/>
+          <w:color w:val="000000"/>
+          <w:kern w:val="0"/>
+          <w14:ligatures w14:val="none"/>
+        </w:rPr>
+      </w:pPr>
+      <w:proofErr w:type="spellStart"/>
+      <w:r>
+        <w:rPr>
+          <w:rFonts w:ascii="Arial MT" w:eastAsia="Times New Roman" w:hAnsi="Arial MT" w:cs="Calibri"/>
+          <w:b/>
+          <w:bCs/>
+          <w:color w:val="000000"/>
+          <w:kern w:val="0"/>
+          <w14:ligatures w14:val="none"/>
+        </w:rPr>
+        <w:t>What</w:t>
+      </w:r>
+      <w:proofErr w:type="spellEnd"/>
+      <w:r>
+        <w:rPr>
+          <w:rFonts w:ascii="Arial MT" w:eastAsia="Times New Roman" w:hAnsi="Arial MT" w:cs="Calibri"/>
+          <w:b/>
+          <w:bCs/>
+          <w:color w:val="000000"/>
+          <w:kern w:val="0"/>
+          <w14:ligatures w14:val="none"/>
+        </w:rPr>
+        <w:t xml:space="preserve"> </w:t>
+      </w:r>
+      <w:proofErr w:type="spellStart"/>
+      <w:r>
+        <w:rPr>
+          <w:rFonts w:ascii="Arial MT" w:eastAsia="Times New Roman" w:hAnsi="Arial MT" w:cs="Calibri"/>
+          <w:b/>
+          <w:bCs/>
+          <w:color w:val="000000"/>
+          <w:kern w:val="0"/>
+          <w14:ligatures w14:val="none"/>
+        </w:rPr>
+        <w:t>is</w:t>
+      </w:r>
+      <w:proofErr w:type="spellEnd"/>
+      <w:r>
+        <w:rPr>
+          <w:rFonts w:ascii="Arial MT" w:eastAsia="Times New Roman" w:hAnsi="Arial MT" w:cs="Calibri"/>
+          <w:b/>
+          <w:bCs/>
+          <w:color w:val="000000"/>
+          <w:kern w:val="0"/>
+          <w14:ligatures w14:val="none"/>
+        </w:rPr>
+        <w:t xml:space="preserve"> Digital </w:t>
+      </w:r>
+      <w:proofErr w:type="spellStart"/>
+      <w:r>
+        <w:rPr>
+          <w:rFonts w:ascii="Arial MT" w:eastAsia="Times New Roman" w:hAnsi="Arial MT" w:cs="Calibri"/>
+          <w:b/>
+          <w:bCs/>
+          <w:color w:val="000000"/>
+          <w:kern w:val="0"/>
+          <w14:ligatures w14:val="none"/>
+        </w:rPr>
+        <w:t>Signage</w:t>
+      </w:r>
+      <w:proofErr w:type="spellEnd"/>
+      <w:r>
+        <w:rPr>
+          <w:rFonts w:ascii="Arial MT" w:eastAsia="Times New Roman" w:hAnsi="Arial MT" w:cs="Calibri"/>
+          <w:b/>
+          <w:bCs/>
+          <w:color w:val="000000"/>
+          <w:kern w:val="0"/>
+          <w14:ligatures w14:val="none"/>
+        </w:rPr>
+        <w:t xml:space="preserve"> | 4yousee</w:t>
+      </w:r>
+      <w:r>
+        <w:rPr>
+          <w:rFonts w:ascii="Arial MT" w:eastAsia="Times New Roman" w:hAnsi="Arial MT" w:cs="Calibri"/>
+          <w:color w:val="000000"/>
+          <w:kern w:val="0"/>
+          <w14:ligatures w14:val="none"/>
+        </w:rPr>
+        <w:t>. Disponível em: &lt;https://www.4yousee.com.br/</w:t>
+      </w:r>
+      <w:proofErr w:type="spellStart"/>
+      <w:r>
+        <w:rPr>
+          <w:rFonts w:ascii="Arial MT" w:eastAsia="Times New Roman" w:hAnsi="Arial MT" w:cs="Calibri"/>
+          <w:color w:val="000000"/>
+          <w:kern w:val="0"/>
+          <w14:ligatures w14:val="none"/>
+        </w:rPr>
+        <w:t>en</w:t>
+      </w:r>
+      <w:proofErr w:type="spellEnd"/>
+      <w:r>
+        <w:rPr>
+          <w:rFonts w:ascii="Arial MT" w:eastAsia="Times New Roman" w:hAnsi="Arial MT" w:cs="Calibri"/>
+          <w:color w:val="000000"/>
+          <w:kern w:val="0"/>
+          <w14:ligatures w14:val="none"/>
+        </w:rPr>
+        <w:t>/digital-</w:t>
+      </w:r>
+      <w:proofErr w:type="spellStart"/>
+      <w:r>
+        <w:rPr>
+          <w:rFonts w:ascii="Arial MT" w:eastAsia="Times New Roman" w:hAnsi="Arial MT" w:cs="Calibri"/>
+          <w:color w:val="000000"/>
+          <w:kern w:val="0"/>
+          <w14:ligatures w14:val="none"/>
+        </w:rPr>
+        <w:t>signage</w:t>
+      </w:r>
+      <w:proofErr w:type="spellEnd"/>
+      <w:r>
+        <w:rPr>
+          <w:rFonts w:ascii="Arial MT" w:eastAsia="Times New Roman" w:hAnsi="Arial MT" w:cs="Calibri"/>
+          <w:color w:val="000000"/>
+          <w:kern w:val="0"/>
+          <w14:ligatures w14:val="none"/>
+        </w:rPr>
+        <w:t>/&gt;. Acesso em: 5 mar. 2026.</w:t>
+      </w:r>
+    </w:p>
+    <w:p>
+      <w:pPr>
+        <w:spacing w:after="0" w:line="360" w:lineRule="atLeast"/>
+        <w:rPr>
+          <w:rFonts w:ascii="Arial MT" w:eastAsia="Times New Roman" w:hAnsi="Arial MT" w:cs="Calibri"/>
+          <w:color w:val="000000"/>
+          <w:kern w:val="0"/>
+          <w14:ligatures w14:val="none"/>
+        </w:rPr>
+      </w:pPr>
+    </w:p>
+    <w:p>
+      <w:pPr>
+        <w:spacing w:after="0" w:line="360" w:lineRule="atLeast"/>
+        <w:rPr>
+          <w:rFonts w:ascii="Arial MT" w:eastAsia="Times New Roman" w:hAnsi="Arial MT" w:cs="Calibri"/>
+          <w:color w:val="000000"/>
+          <w:kern w:val="0"/>
+          <w14:ligatures w14:val="none"/>
+        </w:rPr>
+      </w:pPr>
+      <w:r>
+        <w:rPr>
+          <w:rFonts w:ascii="Arial MT" w:eastAsia="Times New Roman" w:hAnsi="Arial MT" w:cs="Calibri"/>
+          <w:b/>
+          <w:bCs/>
+          <w:color w:val="000000"/>
+          <w:kern w:val="0"/>
+          <w14:ligatures w14:val="none"/>
+        </w:rPr>
+        <w:t>Definição de ROI de Marketing</w:t>
+      </w:r>
+      <w:r>
+        <w:rPr>
+          <w:rFonts w:ascii="Arial MT" w:eastAsia="Times New Roman" w:hAnsi="Arial MT" w:cs="Calibri"/>
+          <w:color w:val="000000"/>
+          <w:kern w:val="0"/>
+          <w14:ligatures w14:val="none"/>
+        </w:rPr>
+        <w:t>. Disponível em: &lt;https://www.oracle.com/</w:t>
+      </w:r>
+      <w:proofErr w:type="spellStart"/>
+      <w:r>
+        <w:rPr>
+          <w:rFonts w:ascii="Arial MT" w:eastAsia="Times New Roman" w:hAnsi="Arial MT" w:cs="Calibri"/>
+          <w:color w:val="000000"/>
+          <w:kern w:val="0"/>
+          <w14:ligatures w14:val="none"/>
+        </w:rPr>
+        <w:t>br</w:t>
+      </w:r>
+      <w:proofErr w:type="spellEnd"/>
+      <w:r>
+        <w:rPr>
+          <w:rFonts w:ascii="Arial MT" w:eastAsia="Times New Roman" w:hAnsi="Arial MT" w:cs="Calibri"/>
+          <w:color w:val="000000"/>
+          <w:kern w:val="0"/>
+          <w14:ligatures w14:val="none"/>
+        </w:rPr>
+        <w:t>/</w:t>
+      </w:r>
+      <w:proofErr w:type="spellStart"/>
+      <w:r>
+        <w:rPr>
+          <w:rFonts w:ascii="Arial MT" w:eastAsia="Times New Roman" w:hAnsi="Arial MT" w:cs="Calibri"/>
+          <w:color w:val="000000"/>
+          <w:kern w:val="0"/>
+          <w14:ligatures w14:val="none"/>
+        </w:rPr>
+        <w:t>cx</w:t>
+      </w:r>
+      <w:proofErr w:type="spellEnd"/>
+      <w:r>
+        <w:rPr>
+          <w:rFonts w:ascii="Arial MT" w:eastAsia="Times New Roman" w:hAnsi="Arial MT" w:cs="Calibri"/>
+          <w:color w:val="000000"/>
+          <w:kern w:val="0"/>
+          <w14:ligatures w14:val="none"/>
+        </w:rPr>
+        <w:t>/marketing/marketing-</w:t>
+      </w:r>
+      <w:proofErr w:type="spellStart"/>
+      <w:r>
+        <w:rPr>
+          <w:rFonts w:ascii="Arial MT" w:eastAsia="Times New Roman" w:hAnsi="Arial MT" w:cs="Calibri"/>
+          <w:color w:val="000000"/>
+          <w:kern w:val="0"/>
+          <w14:ligatures w14:val="none"/>
+        </w:rPr>
+        <w:t>roi</w:t>
+      </w:r>
+      <w:proofErr w:type="spellEnd"/>
+      <w:r>
+        <w:rPr>
+          <w:rFonts w:ascii="Arial MT" w:eastAsia="Times New Roman" w:hAnsi="Arial MT" w:cs="Calibri"/>
+          <w:color w:val="000000"/>
+          <w:kern w:val="0"/>
+          <w14:ligatures w14:val="none"/>
+        </w:rPr>
+        <w:t>/&gt;.</w:t>
+      </w:r>
+    </w:p>
+    <w:p>
+      <w:pPr>
+        <w:spacing w:after="0" w:line="360" w:lineRule="atLeast"/>
+        <w:rPr>
+          <w:rFonts w:ascii="Arial MT" w:eastAsia="Times New Roman" w:hAnsi="Arial MT" w:cs="Calibri"/>
+          <w:color w:val="000000"/>
+          <w:kern w:val="0"/>
+          <w14:ligatures w14:val="none"/>
+        </w:rPr>
+      </w:pPr>
+    </w:p>
+    <w:p>
+      <w:pPr>
+        <w:spacing w:after="0" w:line="360" w:lineRule="atLeast"/>
+        <w:rPr>
+          <w:rFonts w:ascii="Arial MT" w:eastAsia="Times New Roman" w:hAnsi="Arial MT" w:cs="Calibri"/>
+          <w:color w:val="000000"/>
+          <w:kern w:val="0"/>
+          <w14:ligatures w14:val="none"/>
+        </w:rPr>
+      </w:pPr>
+      <w:r>
+        <w:rPr>
+          <w:rFonts w:ascii="Arial MT" w:eastAsia="Times New Roman" w:hAnsi="Arial MT" w:cs="Calibri"/>
+          <w:color w:val="000000"/>
+          <w:kern w:val="0"/>
+          <w14:ligatures w14:val="none"/>
+        </w:rPr>
+        <w:t>SANTODIGITAL. </w:t>
+      </w:r>
+      <w:proofErr w:type="spellStart"/>
+      <w:r>
+        <w:rPr>
+          <w:rFonts w:ascii="Arial MT" w:eastAsia="Times New Roman" w:hAnsi="Arial MT" w:cs="Calibri"/>
+          <w:b/>
+          <w:bCs/>
+          <w:color w:val="000000"/>
+          <w:kern w:val="0"/>
+          <w14:ligatures w14:val="none"/>
+        </w:rPr>
+        <w:t>Downtime</w:t>
+      </w:r>
+      <w:proofErr w:type="spellEnd"/>
+      <w:r>
+        <w:rPr>
+          <w:rFonts w:ascii="Arial MT" w:eastAsia="Times New Roman" w:hAnsi="Arial MT" w:cs="Calibri"/>
+          <w:b/>
+          <w:bCs/>
+          <w:color w:val="000000"/>
+          <w:kern w:val="0"/>
+          <w14:ligatures w14:val="none"/>
+        </w:rPr>
+        <w:t>: o que é, consequências e como evitar</w:t>
+      </w:r>
+      <w:r>
+        <w:rPr>
+          <w:rFonts w:ascii="Arial MT" w:eastAsia="Times New Roman" w:hAnsi="Arial MT" w:cs="Calibri"/>
+          <w:color w:val="000000"/>
+          <w:kern w:val="0"/>
+          <w14:ligatures w14:val="none"/>
+        </w:rPr>
+        <w:t>. Disponível em: &lt;https://santodigital.com.br/</w:t>
+      </w:r>
+      <w:proofErr w:type="spellStart"/>
+      <w:r>
+        <w:rPr>
+          <w:rFonts w:ascii="Arial MT" w:eastAsia="Times New Roman" w:hAnsi="Arial MT" w:cs="Calibri"/>
+          <w:color w:val="000000"/>
+          <w:kern w:val="0"/>
+          <w14:ligatures w14:val="none"/>
+        </w:rPr>
+        <w:t>downtime</w:t>
+      </w:r>
+      <w:proofErr w:type="spellEnd"/>
+      <w:r>
+        <w:rPr>
+          <w:rFonts w:ascii="Arial MT" w:eastAsia="Times New Roman" w:hAnsi="Arial MT" w:cs="Calibri"/>
+          <w:color w:val="000000"/>
+          <w:kern w:val="0"/>
+          <w14:ligatures w14:val="none"/>
+        </w:rPr>
+        <w:t>/&gt;. Acesso em: 5 mar. 2026.</w:t>
+      </w:r>
+    </w:p>
+    <w:p>
+      <w:pPr>
+        <w:spacing w:after="0" w:line="360" w:lineRule="atLeast"/>
+        <w:rPr>
+          <w:rFonts w:ascii="Arial MT" w:eastAsia="Times New Roman" w:hAnsi="Arial MT" w:cs="Calibri"/>
+          <w:color w:val="000000"/>
+          <w:kern w:val="0"/>
+          <w14:ligatures w14:val="none"/>
+        </w:rPr>
+      </w:pPr>
+    </w:p>
+    <w:p>
+      <w:pPr>
+        <w:spacing w:after="0" w:line="360" w:lineRule="atLeast"/>
+        <w:rPr>
+          <w:rFonts w:ascii="Arial MT" w:eastAsia="Times New Roman" w:hAnsi="Arial MT" w:cs="Calibri"/>
+          <w:color w:val="000000"/>
+          <w:kern w:val="0"/>
+          <w14:ligatures w14:val="none"/>
+        </w:rPr>
+      </w:pPr>
+      <w:r>
+        <w:rPr>
+          <w:rFonts w:ascii="Arial MT" w:eastAsia="Times New Roman" w:hAnsi="Arial MT" w:cs="Calibri"/>
+          <w:b/>
+          <w:bCs/>
+          <w:color w:val="000000"/>
+          <w:kern w:val="0"/>
+          <w14:ligatures w14:val="none"/>
+        </w:rPr>
+        <w:t xml:space="preserve">10 </w:t>
+      </w:r>
+      <w:proofErr w:type="spellStart"/>
+      <w:r>
+        <w:rPr>
+          <w:rFonts w:ascii="Arial MT" w:eastAsia="Times New Roman" w:hAnsi="Arial MT" w:cs="Calibri"/>
+          <w:b/>
+          <w:bCs/>
+          <w:color w:val="000000"/>
+          <w:kern w:val="0"/>
+          <w14:ligatures w14:val="none"/>
+        </w:rPr>
+        <w:t>Benefits</w:t>
+      </w:r>
+      <w:proofErr w:type="spellEnd"/>
+      <w:r>
+        <w:rPr>
+          <w:rFonts w:ascii="Arial MT" w:eastAsia="Times New Roman" w:hAnsi="Arial MT" w:cs="Calibri"/>
+          <w:b/>
+          <w:bCs/>
+          <w:color w:val="000000"/>
+          <w:kern w:val="0"/>
+          <w14:ligatures w14:val="none"/>
+        </w:rPr>
+        <w:t xml:space="preserve"> </w:t>
+      </w:r>
+      <w:proofErr w:type="spellStart"/>
+      <w:r>
+        <w:rPr>
+          <w:rFonts w:ascii="Arial MT" w:eastAsia="Times New Roman" w:hAnsi="Arial MT" w:cs="Calibri"/>
+          <w:b/>
+          <w:bCs/>
+          <w:color w:val="000000"/>
+          <w:kern w:val="0"/>
+          <w14:ligatures w14:val="none"/>
+        </w:rPr>
+        <w:t>of</w:t>
+      </w:r>
+      <w:proofErr w:type="spellEnd"/>
+      <w:r>
+        <w:rPr>
+          <w:rFonts w:ascii="Arial MT" w:eastAsia="Times New Roman" w:hAnsi="Arial MT" w:cs="Calibri"/>
+          <w:b/>
+          <w:bCs/>
+          <w:color w:val="000000"/>
+          <w:kern w:val="0"/>
+          <w14:ligatures w14:val="none"/>
+        </w:rPr>
+        <w:t xml:space="preserve"> </w:t>
+      </w:r>
+      <w:proofErr w:type="spellStart"/>
+      <w:r>
+        <w:rPr>
+          <w:rFonts w:ascii="Arial MT" w:eastAsia="Times New Roman" w:hAnsi="Arial MT" w:cs="Calibri"/>
+          <w:b/>
+          <w:bCs/>
+          <w:color w:val="000000"/>
+          <w:kern w:val="0"/>
+          <w14:ligatures w14:val="none"/>
+        </w:rPr>
+        <w:t>Programmatic</w:t>
+      </w:r>
+      <w:proofErr w:type="spellEnd"/>
+      <w:r>
+        <w:rPr>
+          <w:rFonts w:ascii="Arial MT" w:eastAsia="Times New Roman" w:hAnsi="Arial MT" w:cs="Calibri"/>
+          <w:b/>
+          <w:bCs/>
+          <w:color w:val="000000"/>
+          <w:kern w:val="0"/>
+          <w14:ligatures w14:val="none"/>
+        </w:rPr>
+        <w:t xml:space="preserve"> Digital-Out-</w:t>
+      </w:r>
+      <w:proofErr w:type="spellStart"/>
+      <w:r>
+        <w:rPr>
+          <w:rFonts w:ascii="Arial MT" w:eastAsia="Times New Roman" w:hAnsi="Arial MT" w:cs="Calibri"/>
+          <w:b/>
+          <w:bCs/>
+          <w:color w:val="000000"/>
+          <w:kern w:val="0"/>
+          <w14:ligatures w14:val="none"/>
+        </w:rPr>
+        <w:t>of</w:t>
+      </w:r>
+      <w:proofErr w:type="spellEnd"/>
+      <w:r>
+        <w:rPr>
+          <w:rFonts w:ascii="Arial MT" w:eastAsia="Times New Roman" w:hAnsi="Arial MT" w:cs="Calibri"/>
+          <w:b/>
+          <w:bCs/>
+          <w:color w:val="000000"/>
+          <w:kern w:val="0"/>
+          <w14:ligatures w14:val="none"/>
+        </w:rPr>
+        <w:t>-Home (</w:t>
+      </w:r>
+      <w:proofErr w:type="spellStart"/>
+      <w:r>
+        <w:rPr>
+          <w:rFonts w:ascii="Arial MT" w:eastAsia="Times New Roman" w:hAnsi="Arial MT" w:cs="Calibri"/>
+          <w:b/>
+          <w:bCs/>
+          <w:color w:val="000000"/>
+          <w:kern w:val="0"/>
+          <w14:ligatures w14:val="none"/>
+        </w:rPr>
+        <w:t>pDOOH</w:t>
+      </w:r>
+      <w:proofErr w:type="spellEnd"/>
+      <w:r>
+        <w:rPr>
+          <w:rFonts w:ascii="Arial MT" w:eastAsia="Times New Roman" w:hAnsi="Arial MT" w:cs="Calibri"/>
+          <w:b/>
+          <w:bCs/>
+          <w:color w:val="000000"/>
+          <w:kern w:val="0"/>
+          <w14:ligatures w14:val="none"/>
+        </w:rPr>
+        <w:t>)</w:t>
+      </w:r>
+      <w:r>
+        <w:rPr>
+          <w:rFonts w:ascii="Arial MT" w:eastAsia="Times New Roman" w:hAnsi="Arial MT" w:cs="Calibri"/>
+          <w:color w:val="000000"/>
+          <w:kern w:val="0"/>
+          <w14:ligatures w14:val="none"/>
+        </w:rPr>
+        <w:t>. Disponível em: &lt;https://perion.com/dooh/10-benefits-of-programmatic-digital-out-of-home-pdooh/&gt;.</w:t>
+      </w:r>
+    </w:p>
+    <w:p>
+      <w:pPr>
+        <w:spacing w:after="0" w:line="360" w:lineRule="atLeast"/>
+        <w:rPr>
+          <w:rFonts w:ascii="Arial MT" w:eastAsia="Times New Roman" w:hAnsi="Arial MT" w:cs="Calibri"/>
+          <w:color w:val="000000"/>
+          <w:kern w:val="0"/>
+          <w14:ligatures w14:val="none"/>
+        </w:rPr>
+      </w:pPr>
+    </w:p>
+    <w:p>
+      <w:pPr>
+        <w:spacing w:after="0" w:line="360" w:lineRule="atLeast"/>
+        <w:rPr>
+          <w:rFonts w:ascii="Arial MT" w:eastAsia="Times New Roman" w:hAnsi="Arial MT" w:cs="Calibri"/>
+          <w:color w:val="000000"/>
+          <w:kern w:val="0"/>
+          <w14:ligatures w14:val="none"/>
+        </w:rPr>
+      </w:pPr>
+      <w:r>
+        <w:rPr>
+          <w:rFonts w:ascii="Arial MT" w:eastAsia="Times New Roman" w:hAnsi="Arial MT" w:cs="Calibri"/>
+          <w:color w:val="000000"/>
+          <w:kern w:val="0"/>
+          <w14:ligatures w14:val="none"/>
+        </w:rPr>
+        <w:t>MENSAGEM, M. </w:t>
+      </w:r>
+      <w:r>
+        <w:rPr>
+          <w:rFonts w:ascii="Arial MT" w:eastAsia="Times New Roman" w:hAnsi="Arial MT" w:cs="Calibri"/>
+          <w:b/>
+          <w:bCs/>
+          <w:color w:val="000000"/>
+          <w:kern w:val="0"/>
+          <w14:ligatures w14:val="none"/>
+        </w:rPr>
+        <w:t>IAB: 71% das empresas aumentarão investimento em DOOH</w:t>
+      </w:r>
+      <w:r>
+        <w:rPr>
+          <w:rFonts w:ascii="Arial MT" w:eastAsia="Times New Roman" w:hAnsi="Arial MT" w:cs="Calibri"/>
+          <w:color w:val="000000"/>
+          <w:kern w:val="0"/>
+          <w14:ligatures w14:val="none"/>
+        </w:rPr>
+        <w:t>. Disponível em: &lt;https://www.meioemensagem.com.br/midia/iab-investimento-em-dooh&gt;. Acesso em: 5 mar. 2026.</w:t>
+      </w:r>
+    </w:p>
+    <w:p>
+      <w:pPr>
+        <w:spacing w:after="0" w:line="360" w:lineRule="atLeast"/>
+        <w:rPr>
+          <w:rFonts w:ascii="Arial MT" w:eastAsia="Times New Roman" w:hAnsi="Arial MT" w:cs="Calibri"/>
+          <w:color w:val="000000"/>
+          <w:kern w:val="0"/>
+          <w14:ligatures w14:val="none"/>
+        </w:rPr>
+      </w:pPr>
+    </w:p>
+    <w:p>
+      <w:pPr>
+        <w:spacing w:after="0" w:line="360" w:lineRule="atLeast"/>
+        <w:rPr>
+          <w:rFonts w:ascii="Arial MT" w:eastAsia="Times New Roman" w:hAnsi="Arial MT" w:cs="Calibri"/>
+          <w:color w:val="000000"/>
+          <w:kern w:val="0"/>
+          <w14:ligatures w14:val="none"/>
+        </w:rPr>
+      </w:pPr>
+      <w:r>
+        <w:rPr>
+          <w:rFonts w:ascii="Arial MT" w:eastAsia="Times New Roman" w:hAnsi="Arial MT" w:cs="Calibri"/>
+          <w:b/>
+          <w:bCs/>
+          <w:color w:val="000000"/>
+          <w:kern w:val="0"/>
+          <w14:ligatures w14:val="none"/>
+        </w:rPr>
+        <w:t>Vitrines Digitais viram novo canal de mídia das marcas</w:t>
+      </w:r>
+      <w:r>
+        <w:rPr>
+          <w:rFonts w:ascii="Arial MT" w:eastAsia="Times New Roman" w:hAnsi="Arial MT" w:cs="Calibri"/>
+          <w:color w:val="000000"/>
+          <w:kern w:val="0"/>
+          <w14:ligatures w14:val="none"/>
+        </w:rPr>
+        <w:t>. Disponível em: &lt;https://www.terra.com.br/noticias/vitrines-digitais-viram-novo-canal-de-midia-das-marcas,d9a4935d8634ba36be87369b1f7d032eij5isqgz.html&gt;. Acesso em: 19 fev. 2025.</w:t>
+      </w:r>
+    </w:p>
+    <w:p>
+      <w:pPr>
+        <w:spacing w:before="100" w:beforeAutospacing="1" w:after="100" w:afterAutospacing="1" w:line="240" w:lineRule="auto"/>
+        <w:rPr>
+          <w:rFonts w:ascii="Arial MT" w:eastAsia="Times New Roman" w:hAnsi="Arial MT" w:cs="Calibri"/>
+          <w:color w:val="000000"/>
+          <w:kern w:val="0"/>
+          <w14:ligatures w14:val="none"/>
+        </w:rPr>
+      </w:pPr>
+      <w:r>
+        <w:rPr>
+          <w:rFonts w:ascii="Arial MT" w:eastAsia="Times New Roman" w:hAnsi="Arial MT" w:cs="Calibri"/>
+          <w:color w:val="000000"/>
+          <w:kern w:val="0"/>
+          <w14:ligatures w14:val="none"/>
+        </w:rPr>
+        <w:t>‌</w:t>
+      </w:r>
+    </w:p>
+    <w:p>
+      <w:pPr>
         <w:pStyle w:val="PargrafodaLista"/>
         <w:spacing w:line="360" w:lineRule="auto"/>
         <w:jc w:val="both"/>
@@ -10181,8 +11229,13 @@
       <w:r>
         <w:annotationRef/>
       </w:r>
-      <w:r>
-        <w:t>esta correto, ELES atualizam seus anuncios em tempos reais</w:t>
+      <w:proofErr w:type="gramStart"/>
+      <w:r>
+        <w:t>esta</w:t>
+      </w:r>
+      <w:proofErr w:type="gramEnd"/>
+      <w:r>
+        <w:t xml:space="preserve"> correto, ELES atualizam seus anuncios em tempos reais</w:t>
       </w:r>
     </w:p>
     <w:p/>
@@ -10204,7 +11257,15 @@
         <w:annotationRef/>
       </w:r>
       <w:r>
-        <w:t xml:space="preserve">Talvez fosse prioridade focar muito mais na sustentabilidade do negocio, como principal objetivo do sistema. Esta implicado em partes, mas mal é dito explicitamente </w:t>
+        <w:t xml:space="preserve">Talvez fosse prioridade focar muito mais na sustentabilidade do negocio, como principal objetivo do sistema. </w:t>
+      </w:r>
+      <w:proofErr w:type="gramStart"/>
+      <w:r>
+        <w:t>Esta</w:t>
+      </w:r>
+      <w:proofErr w:type="gramEnd"/>
+      <w:r>
+        <w:t xml:space="preserve"> implicado em partes, mas mal é dito explicitamente </w:t>
       </w:r>
     </w:p>
   </w:comment>

</xml_diff>